<commit_message>
Sales Invoice report update
</commit_message>
<xml_diff>
--- a/Layouts/StandardPurchaseOrder.docx
+++ b/Layouts/StandardPurchaseOrder.docx
@@ -5550,6 +5550,8 @@
  
              < R e p o r t N a m e > R e p o r t   N a m e < / R e p o r t N a m e >   
+             < R e p o r t C a p t i o n > R e p o r t   C a p t i o n < / R e p o r t C a p t i o n > + 
              < A b o u t T h i s R e p o r t T i t l e > A b o u t   T h i s   R e p o r t   T i t l e < / A b o u t T h i s R e p o r t T i t l e >   
              < A b o u t T h i s R e p o r t T e x t > A b o u t   T h i s   R e p o r t   T e x t < / A b o u t T h i s R e p o r t T e x t > @@ -5595,6 +5597,84 @@
              < / D a t e T i m e V a l u e s >   
          < / R e p o r t R e q u e s t > + 
+         < C o m p a n y M e t a d a t a > + 
+             < C o m p a n y N a m e > C o m p a n y   N a m e < / C o m p a n y N a m e > + 
+             < C o m p a n y D i s p l a y N a m e > C o m p a n y   D i s p l a y   N a m e < / C o m p a n y D i s p l a y N a m e > + 
+             < C o m p a n y A d d r e s s L i n e s > + 
+                 < C o m p a n y A d d r e s s L i n e 1 > C o m p a n y   A d d r e s s   L i n e   1 < / C o m p a n y A d d r e s s L i n e 1 > + 
+                 < C o m p a n y A d d r e s s L i n e 2 > C o m p a n y   A d d r e s s   L i n e   2 < / C o m p a n y A d d r e s s L i n e 2 > + 
+                 < C o m p a n y A d d r e s s L i n e 3 > C o m p a n y   A d d r e s s   L i n e   3 < / C o m p a n y A d d r e s s L i n e 3 > + 
+                 < C o m p a n y A d d r e s s L i n e 4 > C o m p a n y   A d d r e s s   L i n e   4 < / C o m p a n y A d d r e s s L i n e 4 > + 
+                 < C o m p a n y A d d r e s s L i n e 5 > C o m p a n y   A d d r e s s   L i n e   5 < / C o m p a n y A d d r e s s L i n e 5 > + 
+                 < C o m p a n y A d d r e s s L i n e 6 > C o m p a n y   A d d r e s s   L i n e   6 < / C o m p a n y A d d r e s s L i n e 6 > + 
+                 < C o m p a n y A d d r e s s L i n e 7 > C o m p a n y   A d d r e s s   L i n e   7 < / C o m p a n y A d d r e s s L i n e 7 > + 
+                 < C o m p a n y A d d r e s s L i n e 8 > C o m p a n y   A d d r e s s   L i n e   8 < / C o m p a n y A d d r e s s L i n e 8 > + 
+             < / C o m p a n y A d d r e s s L i n e s > + 
+             < C o m p a n y P h o n e > C o m p a n y   P h o n e < / C o m p a n y P h o n e > + 
+             < C o m p a n y P h o n e C a p t i o n > C o m p a n y   P h o n e   C a p t i o n < / C o m p a n y P h o n e C a p t i o n > + 
+             < C o m p a n y F a x N o > C o m p a n y   F a x   N o . < / C o m p a n y F a x N o > + 
+             < C o m p a n y F a x N o C a p t i o n > C o m p a n y   F a x   N o .   C a p t i o n < / C o m p a n y F a x N o C a p t i o n > + 
+             < C o m p a n y E m a i l > C o m p a n y   E m a i l < / C o m p a n y E m a i l > + 
+             < C o m p a n y E m a i l C a p t i o n > C o m p a n y   E m a i l   C a p t i o n < / C o m p a n y E m a i l C a p t i o n > + 
+             < C o m p a n y H o m e P a g e > C o m p a n y   H o m e   P a g e < / C o m p a n y H o m e P a g e > + 
+             < C o m p a n y H o m e P a g e C a p t i o n > C o m p a n y   H o m e   P a g e   C a p t i o n < / C o m p a n y H o m e P a g e C a p t i o n > + 
+             < C o m p a n y L o g o > C o m p a n y   L o g o < / C o m p a n y L o g o > + 
+             < C o m p a n y V A T R e g i s t r a t i o n N o > C o m p a n y   V A T   R e g i s t r a t i o n   N o . < / C o m p a n y V A T R e g i s t r a t i o n N o > + 
+             < C o m p a n y V A T R e g i s t r a t i o n N o C a p t i o n > C o m p a n y   V A T   R e g i s t r a t i o n   N o .   C a p t i o n < / C o m p a n y V A T R e g i s t r a t i o n N o C a p t i o n > + 
+             < C o m p a n y R e g i s t r a t i o n N o > C o m p a n y   R e g i s t r a t i o n   N o . < / C o m p a n y R e g i s t r a t i o n N o > + 
+             < C o m p a n y R e g i s t r a t i o n N o C a p t i o n > C o m p a n y   R e g i s t r a t i o n   N o .   C a p t i o n < / C o m p a n y R e g i s t r a t i o n N o C a p t i o n > + 
+             < C o m p a n y B a n k N a m e > C o m p a n y   B a n k   N a m e < / C o m p a n y B a n k N a m e > + 
+             < C o m p a n y B a n k N a m e C a p t i o n > C o m p a n y   B a n k   N a m e   C a p t i o n < / C o m p a n y B a n k N a m e C a p t i o n > + 
+             < C o m p a n y B a n k A c c o u n t N o > C o m p a n y   B a n k   A c c o u n t   N o . < / C o m p a n y B a n k A c c o u n t N o > + 
+             < C o m p a n y B a n k A c c o u n t N o C a p t i o n > C o m p a n y   B a n k   A c c o u n t   N o .   C a p t i o n < / C o m p a n y B a n k A c c o u n t N o C a p t i o n > + 
+             < C o m p a n y B a n k B r a n c h N o > C o m p a n y   B a n k   B r a n c h   N o . < / C o m p a n y B a n k B r a n c h N o > + 
+             < C o m p a n y B a n k B r a n c h N o C a p t i o n > C o m p a n y   B a n k   B r a n c h   N o .   C a p t i o n < / C o m p a n y B a n k B r a n c h N o C a p t i o n > + 
+             < C o m p a n y I B A N > C o m p a n y   I B A N < / C o m p a n y I B A N > + 
+             < C o m p a n y I B A N C a p t i o n > C o m p a n y   I B A N   C a p t i o n < / C o m p a n y I B A N C a p t i o n > + 
+             < C o m p a n y B a n k S W I F T > C o m p a n y   B a n k   S W I F T < / C o m p a n y B a n k S W I F T > + 
+             < C o m p a n y B a n k S W I F T C a p t i o n > C o m p a n y   B a n k   S W I F T   C a p t i o n < / C o m p a n y B a n k S W I F T C a p t i o n > + 
+             < C o m p a n y G i r o N o > C o m p a n y   G i r o   N o . < / C o m p a n y G i r o N o > + 
+             < C o m p a n y G i r o N o C a p t i o n > C o m p a n y   G i r o   N o .   C a p t i o n < / C o m p a n y G i r o N o C a p t i o n > + 
+         < / C o m p a n y M e t a d a t a >   
      < / B C R e p o r t I n f o r m a t i o n >   
@@ -6103,6 +6183,659 @@
 
 <file path=customXml/item2.xml><?xml version="1.0" encoding="utf-8"?>
 <b:Sources xmlns:b="http://schemas.openxmlformats.org/officeDocument/2006/bibliography" xmlns="http://schemas.openxmlformats.org/officeDocument/2006/bibliography" SelectedStyle="\APASixthEditionOfficeOnline.xsl" StyleName="APA" Version="6"/>
+</file>
+
+<file path=customXml/item3.xml>��< ? x m l   v e r s i o n = " 1 . 0 "   e n c o d i n g = " u t f - 1 6 " ? > + 
+ < N a v W o r d R e p o r t X m l P a r t   x m l n s = " u r n : m i c r o s o f t - d y n a m i c s - b u s i n e s s c e n t r a l / i n t e r n a l / e x t e n d e d / r e p o r t s / S t a n d a r d _ P u r c h a s e _ O r d e r / 1 3 2 2 / " > + 
+     < B C R e p o r t I n f o r m a t i o n > + 
+         < R e p o r t M e t a d a t a > + 
+             < E x t e n s i o n I d > E x t e n s i o n   I D < / E x t e n s i o n I d > + 
+             < E x t e n s i o n N a m e > E x t e n s i o n   N a m e < / E x t e n s i o n N a m e > + 
+             < E x t e n s i o n P u b l i s h e r > E x t e n s i o n   P u b l i s h e r < / E x t e n s i o n P u b l i s h e r > + 
+             < E x t e n s i o n V e r s i o n > E x t e n s i o n   V e r s i o n < / E x t e n s i o n V e r s i o n > + 
+             < R e p o r t I d > R e p o r t   I D < / R e p o r t I d > + 
+             < R e p o r t N a m e > R e p o r t   N a m e < / R e p o r t N a m e > + 
+             < R e p o r t C a p t i o n > R e p o r t   C a p t i o n < / R e p o r t C a p t i o n > + 
+             < A b o u t T h i s R e p o r t T i t l e > A b o u t   T h i s   R e p o r t   T i t l e < / A b o u t T h i s R e p o r t T i t l e > + 
+             < A b o u t T h i s R e p o r t T e x t > A b o u t   T h i s   R e p o r t   T e x t < / A b o u t T h i s R e p o r t T e x t > + 
+             < R e p o r t H e l p L i n k > R e p o r t   H e l p   L i n k < / R e p o r t H e l p L i n k > + 
+         < / R e p o r t M e t a d a t a > + 
+         < R e p o r t R e q u e s t > + 
+             < T e n a n t E n t r a I d > T e n a n t   E n t r a   I d < / T e n a n t E n t r a I d > + 
+             < E n v i r o n m e n t N a m e > E n v i r o n m e n t   N a m e < / E n v i r o n m e n t N a m e > + 
+             < E n v i r o n m e n t T y p e > E n v i r o n m e n t   T y p e < / E n v i r o n m e n t T y p e > + 
+             < C o m p a n y N a m e > C o m p a n y   N a m e < / C o m p a n y N a m e > + 
+             < C o m p a n y D i s p l a y N a m e > C o m p a n y   D i s p l a y   N a m e < / C o m p a n y D i s p l a y N a m e > + 
+             < C o m p a n y I d > C o m p a n y   I D < / C o m p a n y I d > + 
+             < U s e r N a m e > U s e r   N a m e < / U s e r N a m e > + 
+             < D a t e A n d T i m e > D a t e   a n d   T i m e < / D a t e A n d T i m e > + 
+             < L a n g u a g e > L a n g u a g e < / L a n g u a g e > + 
+             < F o r m a t R e g i o n > F o r m a t   R e g i o n < / F o r m a t R e g i o n > + 
+             < D a t e T i m e V a l u e s > + 
+                 < Y e a r > Y e a r < / Y e a r > + 
+                 < M o n t h N u m b e r > M o n t h   N u m b e r < / M o n t h N u m b e r > + 
+                 < D a y N u m b e r > D a y   N u m b e r < / D a y N u m b e r > + 
+                 < H o u r > H o u r < / H o u r > + 
+                 < M i n u t e > M i n u t e < / M i n u t e > + 
+             < / D a t e T i m e V a l u e s > + 
+         < / R e p o r t R e q u e s t > + 
+         < C o m p a n y M e t a d a t a > + 
+             < C o m p a n y N a m e > C o m p a n y   N a m e < / C o m p a n y N a m e > + 
+             < C o m p a n y D i s p l a y N a m e > C o m p a n y   D i s p l a y   N a m e < / C o m p a n y D i s p l a y N a m e > + 
+             < C o m p a n y A d d r e s s L i n e s > + 
+                 < C o m p a n y A d d r e s s L i n e 1 > C o m p a n y   A d d r e s s   L i n e   1 < / C o m p a n y A d d r e s s L i n e 1 > + 
+                 < C o m p a n y A d d r e s s L i n e 2 > C o m p a n y   A d d r e s s   L i n e   2 < / C o m p a n y A d d r e s s L i n e 2 > + 
+                 < C o m p a n y A d d r e s s L i n e 3 > C o m p a n y   A d d r e s s   L i n e   3 < / C o m p a n y A d d r e s s L i n e 3 > + 
+                 < C o m p a n y A d d r e s s L i n e 4 > C o m p a n y   A d d r e s s   L i n e   4 < / C o m p a n y A d d r e s s L i n e 4 > + 
+                 < C o m p a n y A d d r e s s L i n e 5 > C o m p a n y   A d d r e s s   L i n e   5 < / C o m p a n y A d d r e s s L i n e 5 > + 
+                 < C o m p a n y A d d r e s s L i n e 6 > C o m p a n y   A d d r e s s   L i n e   6 < / C o m p a n y A d d r e s s L i n e 6 > + 
+                 < C o m p a n y A d d r e s s L i n e 7 > C o m p a n y   A d d r e s s   L i n e   7 < / C o m p a n y A d d r e s s L i n e 7 > + 
+                 < C o m p a n y A d d r e s s L i n e 8 > C o m p a n y   A d d r e s s   L i n e   8 < / C o m p a n y A d d r e s s L i n e 8 > + 
+             < / C o m p a n y A d d r e s s L i n e s > + 
+             < C o m p a n y P h o n e > C o m p a n y   P h o n e < / C o m p a n y P h o n e > + 
+             < C o m p a n y P h o n e C a p t i o n > C o m p a n y   P h o n e   C a p t i o n < / C o m p a n y P h o n e C a p t i o n > + 
+             < C o m p a n y F a x N o > C o m p a n y   F a x   N o . < / C o m p a n y F a x N o > + 
+             < C o m p a n y F a x N o C a p t i o n > C o m p a n y   F a x   N o .   C a p t i o n < / C o m p a n y F a x N o C a p t i o n > + 
+             < C o m p a n y E m a i l > C o m p a n y   E m a i l < / C o m p a n y E m a i l > + 
+             < C o m p a n y E m a i l C a p t i o n > C o m p a n y   E m a i l   C a p t i o n < / C o m p a n y E m a i l C a p t i o n > + 
+             < C o m p a n y H o m e P a g e > C o m p a n y   H o m e   P a g e < / C o m p a n y H o m e P a g e > + 
+             < C o m p a n y H o m e P a g e C a p t i o n > C o m p a n y   H o m e   P a g e   C a p t i o n < / C o m p a n y H o m e P a g e C a p t i o n > + 
+             < C o m p a n y L o g o > C o m p a n y   L o g o < / C o m p a n y L o g o > + 
+             < C o m p a n y V A T R e g i s t r a t i o n N o > C o m p a n y   V A T   R e g i s t r a t i o n   N o . < / C o m p a n y V A T R e g i s t r a t i o n N o > + 
+             < C o m p a n y V A T R e g i s t r a t i o n N o C a p t i o n > C o m p a n y   V A T   R e g i s t r a t i o n   N o .   C a p t i o n < / C o m p a n y V A T R e g i s t r a t i o n N o C a p t i o n > + 
+             < C o m p a n y R e g i s t r a t i o n N o > C o m p a n y   R e g i s t r a t i o n   N o . < / C o m p a n y R e g i s t r a t i o n N o > + 
+             < C o m p a n y R e g i s t r a t i o n N o C a p t i o n > C o m p a n y   R e g i s t r a t i o n   N o .   C a p t i o n < / C o m p a n y R e g i s t r a t i o n N o C a p t i o n > + 
+             < C o m p a n y B a n k N a m e > C o m p a n y   B a n k   N a m e < / C o m p a n y B a n k N a m e > + 
+             < C o m p a n y B a n k N a m e C a p t i o n > C o m p a n y   B a n k   N a m e   C a p t i o n < / C o m p a n y B a n k N a m e C a p t i o n > + 
+             < C o m p a n y B a n k A c c o u n t N o > C o m p a n y   B a n k   A c c o u n t   N o . < / C o m p a n y B a n k A c c o u n t N o > + 
+             < C o m p a n y B a n k A c c o u n t N o C a p t i o n > C o m p a n y   B a n k   A c c o u n t   N o .   C a p t i o n < / C o m p a n y B a n k A c c o u n t N o C a p t i o n > + 
+             < C o m p a n y B a n k B r a n c h N o > C o m p a n y   B a n k   B r a n c h   N o . < / C o m p a n y B a n k B r a n c h N o > + 
+             < C o m p a n y B a n k B r a n c h N o C a p t i o n > C o m p a n y   B a n k   B r a n c h   N o .   C a p t i o n < / C o m p a n y B a n k B r a n c h N o C a p t i o n > + 
+             < C o m p a n y I B A N > C o m p a n y   I B A N < / C o m p a n y I B A N > + 
+             < C o m p a n y I B A N C a p t i o n > C o m p a n y   I B A N   C a p t i o n < / C o m p a n y I B A N C a p t i o n > + 
+             < C o m p a n y B a n k S W I F T > C o m p a n y   B a n k   S W I F T < / C o m p a n y B a n k S W I F T > + 
+             < C o m p a n y B a n k S W I F T C a p t i o n > C o m p a n y   B a n k   S W I F T   C a p t i o n < / C o m p a n y B a n k S W I F T C a p t i o n > + 
+             < C o m p a n y G i r o N o > C o m p a n y   G i r o   N o . < / C o m p a n y G i r o N o > + 
+             < C o m p a n y G i r o N o C a p t i o n > C o m p a n y   G i r o   N o .   C a p t i o n < / C o m p a n y G i r o N o C a p t i o n > + 
+         < / C o m p a n y M e t a d a t a > + 
+     < / B C R e p o r t I n f o r m a t i o n > + 
+     < T o o l t i p s   / > + 
+     < P u r c h a s e _ H e a d e r   E l e m e n t T y p e = " D a t a I t e m "   E l e m e n t I d = " 3 0 1 5 4 4 2 5 8 " > + 
+         < A l l o w I n v o i c e D i s c _ L b l   E l e m e n t T y p e = " C o l u m n "   E l e m e n t I d = " 1 4 4 9 1 1 7 7 6 3 "   D a t a T y p e = " L a b e l " > A l l o w I n v o i c e D i s c _ L b l < / A l l o w I n v o i c e D i s c _ L b l > + 
+         < A m o u n t _ L b l   E l e m e n t T y p e = " C o l u m n "   E l e m e n t I d = " 1 8 5 7 4 6 5 8 6 0 "   D a t a T y p e = " L a b e l " > A m o u n t _ L b l < / A m o u n t _ L b l > + 
+         < B u y e r _ L b l   E l e m e n t T y p e = " C o l u m n "   E l e m e n t I d = " 1 7 4 6 3 3 5 4 8 9 "   D a t a T y p e = " L a b e l " > B u y e r _ L b l < / B u y e r _ L b l > + 
+         < B u y F r m V e n d N o _ P u r c h H e a d e r   E l e m e n t T y p e = " C o l u m n "   E l e m e n t I d = " 1 1 4 1 1 5 6 0 2 "   D a t a T y p e = " C o d e " > B u y F r m V e n d N o _ P u r c h H e a d e r < / B u y F r m V e n d N o _ P u r c h H e a d e r > + 
+         < B u y F r m V e n d N o _ P u r c h H e a d e r _ L b l   E l e m e n t T y p e = " C o l u m n "   E l e m e n t I d = " 1 8 5 3 8 7 0 8 5 "   D a t a T y p e = " S t r i n g " > B u y F r m V e n d N o _ P u r c h H e a d e r _ L b l < / B u y F r m V e n d N o _ P u r c h H e a d e r _ L b l > + 
+         < B u y F r o m A d d r 1   E l e m e n t T y p e = " C o l u m n "   E l e m e n t I d = " 9 9 4 5 5 4 4 3 3 "   D a t a T y p e = " T e x t " > B u y F r o m A d d r 1 < / B u y F r o m A d d r 1 > + 
+         < B u y F r o m A d d r 2   E l e m e n t T y p e = " C o l u m n "   E l e m e n t I d = " 1 3 8 7 3 2 3 0 1 2 "   D a t a T y p e = " T e x t " > B u y F r o m A d d r 2 < / B u y F r o m A d d r 2 > + 
+         < B u y F r o m A d d r 3   E l e m e n t T y p e = " C o l u m n "   E l e m e n t I d = " 2 0 2 5 0 1 9 6 2 9 "   D a t a T y p e = " T e x t " > B u y F r o m A d d r 3 < / B u y F r o m A d d r 3 > + 
+         < B u y F r o m A d d r 4   E l e m e n t T y p e = " C o l u m n "   E l e m e n t I d = " 1 1 1 9 2 9 7 7 8 "   D a t a T y p e = " T e x t " > B u y F r o m A d d r 4 < / B u y F r o m A d d r 4 > + 
+         < B u y F r o m A d d r 5   E l e m e n t T y p e = " C o l u m n "   E l e m e n t I d = " 7 4 9 6 2 6 3 9 5 "   D a t a T y p e = " T e x t " > B u y F r o m A d d r 5 < / B u y F r o m A d d r 5 > + 
+         < B u y F r o m A d d r 6   E l e m e n t T y p e = " C o l u m n "   E l e m e n t I d = " 1 1 6 3 4 6 3 4 5 6 "   D a t a T y p e = " T e x t " > B u y F r o m A d d r 6 < / B u y F r o m A d d r 6 > + 
+         < B u y F r o m A d d r 7   E l e m e n t T y p e = " C o l u m n "   E l e m e n t I d = " 5 2 5 7 6 6 8 3 9 "   D a t a T y p e = " T e x t " > B u y F r o m A d d r 7 < / B u y F r o m A d d r 7 > + 
+         < B u y F r o m A d d r 8   E l e m e n t T y p e = " C o l u m n "   E l e m e n t I d = " 8 2 5 6 4 5 4 1 0 "   D a t a T y p e = " T e x t " > B u y F r o m A d d r 8 < / B u y F r o m A d d r 8 > + 
+         < B u y F r o m C o n t a c t E m a i l   E l e m e n t T y p e = " C o l u m n "   E l e m e n t I d = " 1 4 6 0 8 4 1 4 4 9 "   D a t a T y p e = " T e x t " > B u y F r o m C o n t a c t E m a i l < / B u y F r o m C o n t a c t E m a i l > + 
+         < B u y F r o m C o n t a c t E m a i l L b l   E l e m e n t T y p e = " C o l u m n "   E l e m e n t I d = " 4 6 2 0 6 3 8 7 5 "   D a t a T y p e = " L a b e l " > B u y F r o m C o n t a c t E m a i l L b l < / B u y F r o m C o n t a c t E m a i l L b l > + 
+         < B u y F r o m C o n t a c t M o b i l e P h o n e N o   E l e m e n t T y p e = " C o l u m n "   E l e m e n t I d = " 6 8 2 3 8 6 3 9 2 "   D a t a T y p e = " T e x t " > B u y F r o m C o n t a c t M o b i l e P h o n e N o < / B u y F r o m C o n t a c t M o b i l e P h o n e N o > + 
+         < B u y F r o m C o n t a c t M o b i l e P h o n e N o L b l   E l e m e n t T y p e = " C o l u m n "   E l e m e n t I d = " 3 5 0 1 9 3 3 8 "   D a t a T y p e = " L a b e l " > B u y F r o m C o n t a c t M o b i l e P h o n e N o L b l < / B u y F r o m C o n t a c t M o b i l e P h o n e N o L b l > + 
+         < B u y F r o m C o n t a c t P h o n e N o   E l e m e n t T y p e = " C o l u m n "   E l e m e n t I d = " 1 6 2 4 1 1 6 4 9 6 "   D a t a T y p e = " T e x t " > B u y F r o m C o n t a c t P h o n e N o < / B u y F r o m C o n t a c t P h o n e N o > + 
+         < B u y F r o m C o n t a c t P h o n e N o L b l   E l e m e n t T y p e = " C o l u m n "   E l e m e n t I d = " 3 6 1 4 5 0 8 0 2 "   D a t a T y p e = " L a b e l " > B u y F r o m C o n t a c t P h o n e N o L b l < / B u y F r o m C o n t a c t P h o n e N o L b l > + 
+         < C o m p a n y A d d r e s s 1   E l e m e n t T y p e = " C o l u m n "   E l e m e n t I d = " 1 8 8 4 1 6 4 3 2 3 "   D a t a T y p e = " T e x t " > C o m p a n y A d d r e s s 1 < / C o m p a n y A d d r e s s 1 > + 
+         < C o m p a n y A d d r e s s 2   E l e m e n t T y p e = " C o l u m n "   E l e m e n t I d = " 1 2 4 6 4 6 7 7 0 6 "   D a t a T y p e = " T e x t " > C o m p a n y A d d r e s s 2 < / C o m p a n y A d d r e s s 2 > + 
+         < C o m p a n y A d d r e s s 3   E l e m e n t T y p e = " C o l u m n "   E l e m e n t I d = " 6 0 8 7 7 1 0 8 9 "   D a t a T y p e = " T e x t " > C o m p a n y A d d r e s s 3 < / C o m p a n y A d d r e s s 3 > + 
+         < C o m p a n y A d d r e s s 4   E l e m e n t T y p e = " C o l u m n "   E l e m e n t I d = " 7 7 7 6 8 0 1 1 2 "   D a t a T y p e = " T e x t " > C o m p a n y A d d r e s s 4 < / C o m p a n y A d d r e s s 4 > + 
+         < C o m p a n y A d d r e s s 5   E l e m e n t T y p e = " C o l u m n "   E l e m e n t I d = " 1 3 9 9 8 3 4 9 5 "   D a t a T y p e = " T e x t " > C o m p a n y A d d r e s s 5 < / C o m p a n y A d d r e s s 5 > + 
+         < C o m p a n y A d d r e s s 6   E l e m e n t T y p e = " C o l u m n "   E l e m e n t I d = " 4 9 7 7 1 3 1 2 2 "   D a t a T y p e = " T e x t " > C o m p a n y A d d r e s s 6 < / C o m p a n y A d d r e s s 6 > + 
+         < C o m p a n y A d d r e s s 7   E l e m e n t T y p e = " C o l u m n "   E l e m e n t I d = " 1 1 3 5 4 0 9 7 3 9 "   D a t a T y p e = " T e x t " > C o m p a n y A d d r e s s 7 < / C o m p a n y A d d r e s s 7 > + 
+         < C o m p a n y A d d r e s s 8   E l e m e n t T y p e = " C o l u m n "   E l e m e n t I d = " 1 7 1 5 2 5 5 3 0 0 "   D a t a T y p e = " T e x t " > C o m p a n y A d d r e s s 8 < / C o m p a n y A d d r e s s 8 > + 
+         < C o m p a n y B a n k A c c o u n t N o   E l e m e n t T y p e = " C o l u m n "   E l e m e n t I d = " 3 0 1 4 0 2 0 4 "   D a t a T y p e = " T e x t " > C o m p a n y B a n k A c c o u n t N o < / C o m p a n y B a n k A c c o u n t N o > + 
+         < C o m p a n y B a n k A c c o u n t N o _ L b l   E l e m e n t T y p e = " C o l u m n "   E l e m e n t I d = " 1 0 9 7 7 4 3 3 4 5 "   D a t a T y p e = " L a b e l " > C o m p a n y B a n k A c c o u n t N o _ L b l < / C o m p a n y B a n k A c c o u n t N o _ L b l > + 
+         < C o m p a n y B a n k B r a n c h N o   E l e m e n t T y p e = " C o l u m n "   E l e m e n t I d = " 7 9 3 1 3 3 0 5 7 "   D a t a T y p e = " T e x t " > C o m p a n y B a n k B r a n c h N o < / C o m p a n y B a n k B r a n c h N o > + 
+         < C o m p a n y B a n k B r a n c h N o _ L b l   E l e m e n t T y p e = " C o l u m n "   E l e m e n t I d = " 3 2 7 9 0 6 6 9 2 "   D a t a T y p e = " S t r i n g " > C o m p a n y B a n k B r a n c h N o _ L b l < / C o m p a n y B a n k B r a n c h N o _ L b l > + 
+         < C o m p a n y B a n k N a m e   E l e m e n t T y p e = " C o l u m n "   E l e m e n t I d = " 1 5 3 4 9 0 5 6 0 5 "   D a t a T y p e = " T e x t " > C o m p a n y B a n k N a m e < / C o m p a n y B a n k N a m e > + 
+         < C o m p a n y B a n k N a m e _ L b l   E l e m e n t T y p e = " C o l u m n "   E l e m e n t I d = " 1 2 0 4 3 0 7 0 1 4 "   D a t a T y p e = " L a b e l " > C o m p a n y B a n k N a m e _ L b l < / C o m p a n y B a n k N a m e _ L b l > + 
+         < C o m p a n y C u s t o m G i r o   E l e m e n t T y p e = " C o l u m n "   E l e m e n t I d = " 1 6 7 0 4 7 5 7 9 8 "   D a t a T y p e = " T e x t " > C o m p a n y C u s t o m G i r o < / C o m p a n y C u s t o m G i r o > + 
+         < C o m p a n y C u s t o m G i r o _ L b l   E l e m e n t T y p e = " C o l u m n "   E l e m e n t I d = " 8 9 1 4 3 9 6 2 5 "   D a t a T y p e = " T e x t " > C o m p a n y C u s t o m G i r o _ L b l < / C o m p a n y C u s t o m G i r o _ L b l > + 
+         < C o m p a n y E M a i l   E l e m e n t T y p e = " C o l u m n "   E l e m e n t I d = " 1 6 7 7 0 7 4 0 5 8 "   D a t a T y p e = " T e x t " > C o m p a n y E M a i l < / C o m p a n y E M a i l > + 
+         < C o m p a n y E m a i l _ L b l   E l e m e n t T y p e = " C o l u m n "   E l e m e n t I d = " 8 0 8 1 5 9 1 7 9 "   D a t a T y p e = " L a b e l " > C o m p a n y E m a i l _ L b l < / C o m p a n y E m a i l _ L b l > + 
+         < C o m p a n y G i r o N o   E l e m e n t T y p e = " C o l u m n "   E l e m e n t I d = " 1 3 6 0 1 9 6 3 2 0 "   D a t a T y p e = " T e x t " > C o m p a n y G i r o N o < / C o m p a n y G i r o N o > + 
+         < C o m p a n y G i r o N o _ L b l   E l e m e n t T y p e = " C o l u m n "   E l e m e n t I d = " 8 6 1 6 0 2 1 1 5 "   D a t a T y p e = " L a b e l " > C o m p a n y G i r o N o _ L b l < / C o m p a n y G i r o N o _ L b l > + 
+         < C o m p a n y H o m e P a g e   E l e m e n t T y p e = " C o l u m n "   E l e m e n t I d = " 1 9 8 9 1 8 8 7 0 "   D a t a T y p e = " T e x t " > C o m p a n y H o m e P a g e < / C o m p a n y H o m e P a g e > + 
+         < C o m p a n y H o m e P a g e _ L b l   E l e m e n t T y p e = " C o l u m n "   E l e m e n t I d = " 1 5 2 9 3 4 8 1 7 1 "   D a t a T y p e = " L a b e l " > C o m p a n y H o m e P a g e _ L b l < / C o m p a n y H o m e P a g e _ L b l > + 
+         < C o m p a n y I B A N   E l e m e n t T y p e = " C o l u m n "   E l e m e n t I d = " 9 0 6 5 4 9 1 8 2 "   D a t a T y p e = " C o d e " > C o m p a n y I B A N < / C o m p a n y I B A N > + 
+         < C o m p a n y I B A N _ L b l   E l e m e n t T y p e = " C o l u m n "   E l e m e n t I d = " 1 2 6 7 9 5 2 2 2 7 "   D a t a T y p e = " S t r i n g " > C o m p a n y I B A N _ L b l < / C o m p a n y I B A N _ L b l > + 
+         < C o m p a n y I n f o _ P i c t u r e   E l e m e n t T y p e = " C o l u m n "   E l e m e n t I d = " 1 0 0 8 1 8 1 2 7 3 "   D a t a T y p e = " B l o b "   / > + 
+         < C o m p a n y L e g a l O f f i c e   E l e m e n t T y p e = " C o l u m n "   E l e m e n t I d = " 7 1 4 2 5 8 1 1 1 "   D a t a T y p e = " T e x t " > C o m p a n y L e g a l O f f i c e < / C o m p a n y L e g a l O f f i c e > + 
+         < C o m p a n y L e g a l O f f i c e _ L b l   E l e m e n t T y p e = " C o l u m n "   E l e m e n t I d = " 1 5 3 3 1 7 5 1 0 8 "   D a t a T y p e = " T e x t " > C o m p a n y L e g a l O f f i c e _ L b l < / C o m p a n y L e g a l O f f i c e _ L b l > + 
+         < C o m p a n y L o g o P o s i t i o n   E l e m e n t T y p e = " C o l u m n "   E l e m e n t I d = " 1 4 2 5 2 6 6 6 8 8 "   D a t a T y p e = " I n t e g e r " > C o m p a n y L o g o P o s i t i o n < / C o m p a n y L o g o P o s i t i o n > + 
+         < C o m p a n y P h o n e N o   E l e m e n t T y p e = " C o l u m n "   E l e m e n t I d = " 2 5 0 4 4 0 6 5 5 "   D a t a T y p e = " T e x t " > C o m p a n y P h o n e N o < / C o m p a n y P h o n e N o > + 
+         < C o m p a n y P h o n e N o _ L b l   E l e m e n t T y p e = " C o l u m n "   E l e m e n t I d = " 5 5 8 5 9 3 5 8 6 "   D a t a T y p e = " L a b e l " > C o m p a n y P h o n e N o _ L b l < / C o m p a n y P h o n e N o _ L b l > + 
+         < C o m p a n y P i c t u r e   E l e m e n t T y p e = " C o l u m n "   E l e m e n t I d = " 1 3 9 7 4 1 1 0 7 4 "   D a t a T y p e = " B l o b "   / > + 
+         < C o m p a n y R e g i s t r a t i o n N u m b e r   E l e m e n t T y p e = " C o l u m n "   E l e m e n t I d = " 2 0 2 3 6 3 9 4 2 4 "   D a t a T y p e = " T e x t " > C o m p a n y R e g i s t r a t i o n N u m b e r < / C o m p a n y R e g i s t r a t i o n N u m b e r > + 
+         < C o m p a n y R e g i s t r a t i o n N u m b e r _ L b l   E l e m e n t T y p e = " C o l u m n "   E l e m e n t I d = " 1 8 3 3 1 0 6 6 5 3 "   D a t a T y p e = " T e x t " > C o m p a n y R e g i s t r a t i o n N u m b e r _ L b l < / C o m p a n y R e g i s t r a t i o n N u m b e r _ L b l > + 
+         < C o m p a n y S W I F T   E l e m e n t T y p e = " C o l u m n "   E l e m e n t I d = " 6 6 8 2 5 0 2 4 5 "   D a t a T y p e = " C o d e " > C o m p a n y S W I F T < / C o m p a n y S W I F T > + 
+         < C o m p a n y S W I F T _ L b l   E l e m e n t T y p e = " C o l u m n "   E l e m e n t I d = " 2 0 2 9 5 9 7 3 8 4 "   D a t a T y p e = " S t r i n g " > C o m p a n y S W I F T _ L b l < / C o m p a n y S W I F T _ L b l > + 
+         < C o m p a n y V A T R e g i s t r a t i o n N o   E l e m e n t T y p e = " C o l u m n "   E l e m e n t I d = " 1 9 1 4 0 1 3 6 4 9 "   D a t a T y p e = " T e x t " > C o m p a n y V A T R e g i s t r a t i o n N o < / C o m p a n y V A T R e g i s t r a t i o n N o > + 
+         < C o m p a n y V A T R e g i s t r a t i o n N o _ L b l   E l e m e n t T y p e = " C o l u m n "   E l e m e n t I d = " 9 2 4 5 0 3 1 2 4 "   D a t a T y p e = " T e x t " > C o m p a n y V A T R e g i s t r a t i o n N o _ L b l < / C o m p a n y V A T R e g i s t r a t i o n N o _ L b l > + 
+         < C o m p a n y V A T R e g N o   E l e m e n t T y p e = " C o l u m n "   E l e m e n t I d = " 1 7 1 4 3 1 9 3 6 "   D a t a T y p e = " T e x t " > C o m p a n y V A T R e g N o < / C o m p a n y V A T R e g N o > + 
+         < C o m p a n y V A T R e g N o _ L b l   E l e m e n t T y p e = " C o l u m n "   E l e m e n t I d = " 7 7 3 2 0 1 5 0 1 "   D a t a T y p e = " T e x t " > C o m p a n y V A T R e g N o _ L b l < / C o m p a n y V A T R e g N o _ L b l > + 
+         < C o n f i r m T o C a p t i o n _ L b l   E l e m e n t T y p e = " C o l u m n "   E l e m e n t I d = " 1 7 0 5 6 7 2 8 4 1 "   D a t a T y p e = " L a b e l " > C o n f i r m T o C a p t i o n _ L b l < / C o n f i r m T o C a p t i o n _ L b l > + 
+         < D i m T e x t   E l e m e n t T y p e = " C o l u m n "   E l e m e n t I d = " 1 7 6 4 8 3 2 3 2 "   D a t a T y p e = " T e x t " > D i m T e x t < / D i m T e x t > + 
+         < D o c T y p e _ P u r c h H e a d e r   E l e m e n t T y p e = " C o l u m n "   E l e m e n t I d = " 1 9 1 3 4 4 6 4 3 3 "   D a t a T y p e = " E n u m " > D o c T y p e _ P u r c h H e a d e r < / D o c T y p e _ P u r c h H e a d e r > + 
+         < D o c u m e n t D a t e   E l e m e n t T y p e = " C o l u m n "   E l e m e n t I d = " 5 5 2 8 7 1 9 1 4 "   D a t a T y p e = " S t r i n g " > D o c u m e n t D a t e < / D o c u m e n t D a t e > + 
+         < D o c u m e n t D a t e _ L b l   E l e m e n t T y p e = " C o l u m n "   E l e m e n t I d = " 1 0 2 6 4 9 4 8 3 "   D a t a T y p e = " L a b e l " > D o c u m e n t D a t e _ L b l < / D o c u m e n t D a t e _ L b l > + 
+         < D o c u m e n t T i t l e _ L b l   E l e m e n t T y p e = " C o l u m n "   E l e m e n t I d = " 8 5 8 4 2 3 9 2 9 "   D a t a T y p e = " L a b e l " > D o c u m e n t T i t l e _ L b l < / D o c u m e n t T i t l e _ L b l > + 
+         < D u e D a t e   E l e m e n t T y p e = " C o l u m n "   E l e m e n t I d = " 7 4 5 1 7 0 2 0 3 "   D a t a T y p e = " S t r i n g " > D u e D a t e < / D u e D a t e > + 
+         < E m a i l I D _ L b l   E l e m e n t T y p e = " C o l u m n "   E l e m e n t I d = " 1 0 8 1 3 5 7 8 8 9 "   D a t a T y p e = " L a b e l " > E m a i l I D _ L b l < / E m a i l I D _ L b l > + 
+         < E x p t R e c p t D t _ P u r c h a s e H e a d e r   E l e m e n t T y p e = " C o l u m n "   E l e m e n t I d = " 7 5 1 5 1 3 9 8 3 "   D a t a T y p e = " S t r i n g " > E x p t R e c p t D t _ P u r c h a s e H e a d e r < / E x p t R e c p t D t _ P u r c h a s e H e a d e r > + 
+         < H o m e P a g e _ L b l   E l e m e n t T y p e = " C o l u m n "   E l e m e n t I d = " 1 4 3 3 5 9 2 3 0 0 "   D a t a T y p e = " L a b e l " > H o m e P a g e _ L b l < / H o m e P a g e _ L b l > + 
+         < I t e m D e s c r i p t i o n _ L b l   E l e m e n t T y p e = " C o l u m n "   E l e m e n t I d = " 8 3 5 8 4 5 8 5 3 "   D a t a T y p e = " L a b e l " > I t e m D e s c r i p t i o n _ L b l < / I t e m D e s c r i p t i o n _ L b l > + 
+         < I t e m L i n e A m o u n t _ L b l   E l e m e n t T y p e = " C o l u m n "   E l e m e n t I d = " 4 8 8 7 0 7 2 7 "   D a t a T y p e = " L a b e l " > I t e m L i n e A m o u n t _ L b l < / I t e m L i n e A m o u n t _ L b l > + 
+         < I t e m N u m b e r _ L b l   E l e m e n t T y p e = " C o l u m n "   E l e m e n t I d = " 1 3 3 2 2 2 5 7 7 4 "   D a t a T y p e = " L a b e l " > I t e m N u m b e r _ L b l < / I t e m N u m b e r _ L b l > + 
+         < I t e m Q u a n t i t y _ L b l   E l e m e n t T y p e = " C o l u m n "   E l e m e n t I d = " 1 8 0 2 5 9 1 7 6 6 "   D a t a T y p e = " L a b e l " > I t e m Q u a n t i t y _ L b l < / I t e m Q u a n t i t y _ L b l > + 
+         < I t e m U n i t P r i c e _ L b l   E l e m e n t T y p e = " C o l u m n "   E l e m e n t I d = " 4 6 6 8 5 2 9 8 "   D a t a T y p e = " L a b e l " > I t e m U n i t P r i c e _ L b l < / I t e m U n i t P r i c e _ L b l > + 
+         < I t e m U n i t _ L b l   E l e m e n t T y p e = " C o l u m n "   E l e m e n t I d = " 1 9 8 1 4 0 3 7 7 3 "   D a t a T y p e = " L a b e l " > I t e m U n i t _ L b l < / I t e m U n i t _ L b l > + 
+         < N o _ P u r c h H e a d e r   E l e m e n t T y p e = " C o l u m n "   E l e m e n t I d = " 5 2 0 3 3 9 3 5 2 "   D a t a T y p e = " C o d e " > N o _ P u r c h H e a d e r < / N o _ P u r c h H e a d e r > + 
+         < O r d e r D a t e _ L b l   E l e m e n t T y p e = " C o l u m n "   E l e m e n t I d = " 4 1 7 6 9 0 3 9 8 "   D a t a T y p e = " L a b e l " > O r d e r D a t e _ L b l < / O r d e r D a t e _ L b l > + 
+         < O r d e r D a t e _ P u r c h a s e H e a d e r   E l e m e n t T y p e = " C o l u m n "   E l e m e n t I d = " 1 1 1 9 3 3 8 5 4 0 "   D a t a T y p e = " S t r i n g " > O r d e r D a t e _ P u r c h a s e H e a d e r < / O r d e r D a t e _ P u r c h a s e H e a d e r > + 
+         < O r d e r N o _ L b l   E l e m e n t T y p e = " C o l u m n "   E l e m e n t I d = " 1 9 9 1 0 6 2 5 2 9 "   D a t a T y p e = " L a b e l " > O r d e r N o _ L b l < / O r d e r N o _ L b l > + 
+         < O u t p u t N o   E l e m e n t T y p e = " C o l u m n "   E l e m e n t I d = " 1 5 2 4 6 3 6 1 8 1 "   D a t a T y p e = " I n t e g e r " > O u t p u t N o < / O u t p u t N o > + 
+         < P a g e _ L b l   E l e m e n t T y p e = " C o l u m n "   E l e m e n t I d = " 6 8 0 6 4 8 0 9 1 "   D a t a T y p e = " L a b e l " > P a g e _ L b l < / P a g e _ L b l > + 
+         < P a y m e n t D e t a i l s _ L b l   E l e m e n t T y p e = " C o l u m n "   E l e m e n t I d = " 1 0 2 9 7 4 8 9 9 2 "   D a t a T y p e = " L a b e l " > P a y m e n t D e t a i l s _ L b l < / P a y m e n t D e t a i l s _ L b l > + 
+         < P a y m e n t T e r m s D e s c   E l e m e n t T y p e = " C o l u m n "   E l e m e n t I d = " 1 9 8 3 0 0 2 7 7 9 "   D a t a T y p e = " T e x t " > P a y m e n t T e r m s D e s c < / P a y m e n t T e r m s D e s c > + 
+         < P a y m e n t T e r m s D e s c _ L b l   E l e m e n t T y p e = " C o l u m n "   E l e m e n t I d = " 1 4 3 7 8 0 9 5 6 2 "   D a t a T y p e = " L a b e l " > P a y m e n t T e r m s D e s c _ L b l < / P a y m e n t T e r m s D e s c _ L b l > + 
+         < P a y T o C o n t a c t E m a i l   E l e m e n t T y p e = " C o l u m n "   E l e m e n t I d = " 1 9 8 4 8 9 3 3 1 0 "   D a t a T y p e = " T e x t " > P a y T o C o n t a c t E m a i l < / P a y T o C o n t a c t E m a i l > + 
+         < P a y T o C o n t a c t E m a i l L b l   E l e m e n t T y p e = " C o l u m n "   E l e m e n t I d = " 6 8 4 6 8 8 4 8 "   D a t a T y p e = " L a b e l " > P a y T o C o n t a c t E m a i l L b l < / P a y T o C o n t a c t E m a i l L b l > + 
+         < P a y T o C o n t a c t M o b i l e P h o n e N o   E l e m e n t T y p e = " C o l u m n "   E l e m e n t I d = " 1 9 0 1 4 6 6 0 5 "   D a t a T y p e = " T e x t " > P a y T o C o n t a c t M o b i l e P h o n e N o < / P a y T o C o n t a c t M o b i l e P h o n e N o > + 
+         < P a y T o C o n t a c t M o b i l e P h o n e N o L b l   E l e m e n t T y p e = " C o l u m n "   E l e m e n t I d = " 1 2 5 4 4 4 0 0 8 9 "   D a t a T y p e = " L a b e l " > P a y T o C o n t a c t M o b i l e P h o n e N o L b l < / P a y T o C o n t a c t M o b i l e P h o n e N o L b l > + 
+         < P a y T o C o n t a c t P h o n e N o   E l e m e n t T y p e = " C o l u m n "   E l e m e n t I d = " 1 9 2 3 7 9 6 7 0 9 "   D a t a T y p e = " T e x t " > P a y T o C o n t a c t P h o n e N o < / P a y T o C o n t a c t P h o n e N o > + 
+         < P a y T o C o n t a c t P h o n e N o L b l   E l e m e n t T y p e = " C o l u m n "   E l e m e n t I d = " 2 9 3 4 6 1 0 8 7 "   D a t a T y p e = " L a b e l " > P a y T o C o n t a c t P h o n e N o L b l < / P a y T o C o n t a c t P h o n e N o L b l > + 
+         < P a y T o V e n d N o _ P u r c h H e a d e r   E l e m e n t T y p e = " C o l u m n "   E l e m e n t I d = " 6 3 5 5 6 4 4 9 8 "   D a t a T y p e = " C o d e " > P a y T o V e n d N o _ P u r c h H e a d e r < / P a y T o V e n d N o _ P u r c h H e a d e r > + 
+         < P r e p m t P a y m e n t T e r m s D e s c   E l e m e n t T y p e = " C o l u m n "   E l e m e n t I d = " 4 2 9 7 6 4 9 1 "   D a t a T y p e = " T e x t " > P r e p m t P a y m e n t T e r m s D e s c < / P r e p m t P a y m e n t T e r m s D e s c > + 
+         < P r e p y m t T e r m s D e s c _ L b l   E l e m e n t T y p e = " C o l u m n "   E l e m e n t I d = " 1 8 4 2 9 3 9 4 8 5 "   D a t a T y p e = " L a b e l " > P r e p y m t T e r m s D e s c _ L b l < / P r e p y m t T e r m s D e s c _ L b l > + 
+         < P r i c e s I n c l u d i n g V A T _ L b l   E l e m e n t T y p e = " C o l u m n "   E l e m e n t I d = " 1 3 7 7 9 7 9 4 4 4 "   D a t a T y p e = " L a b e l " > P r i c e s I n c l u d i n g V A T _ L b l < / P r i c e s I n c l u d i n g V A T _ L b l > + 
+         < P r i c e s I n c l V A T t x t   E l e m e n t T y p e = " C o l u m n "   E l e m e n t I d = " 1 1 2 3 7 2 4 4 4 8 "   D a t a T y p e = " L a b e l " > P r i c e s I n c l V A T t x t < / P r i c e s I n c l V A T t x t > + 
+         < P r i c e s I n c l V A T _ P u r c h H e a d e r   E l e m e n t T y p e = " C o l u m n "   E l e m e n t I d = " 1 8 0 5 5 0 7 9 8 0 "   D a t a T y p e = " B o o l e a n " > P r i c e s I n c l V A T _ P u r c h H e a d e r < / P r i c e s I n c l V A T _ P u r c h H e a d e r > + 
+         < P r i c e s I n c l V A T _ P u r c h H e a d e r _ L b l   E l e m e n t T y p e = " C o l u m n "   E l e m e n t I d = " 1 7 9 9 5 0 1 7 4 3 "   D a t a T y p e = " S t r i n g " > P r i c e s I n c l V A T _ P u r c h H e a d e r _ L b l < / P r i c e s I n c l V A T _ P u r c h H e a d e r _ L b l > + 
+         < P u r c h a s e r T e x t   E l e m e n t T y p e = " C o l u m n "   E l e m e n t I d = " 1 2 9 1 4 2 3 8 3 3 "   D a t a T y p e = " T e x t " > P u r c h a s e r T e x t < / P u r c h a s e r T e x t > + 
+         < P u r c h L i n e I n v D i s c A m t _ L b l   E l e m e n t T y p e = " C o l u m n "   E l e m e n t I d = " 9 2 6 7 0 5 4 6 2 "   D a t a T y p e = " L a b e l " > P u r c h L i n e I n v D i s c A m t _ L b l < / P u r c h L i n e I n v D i s c A m t _ L b l > + 
+         < P u r c h O r d e r C a p t i o n _ L b l   E l e m e n t T y p e = " C o l u m n "   E l e m e n t I d = " 6 3 3 7 2 3 3 7 2 "   D a t a T y p e = " L a b e l " > P u r c h O r d e r C a p t i o n _ L b l < / P u r c h O r d e r C a p t i o n _ L b l > + 
+         < P u r c h O r d e r D a t e C a p t i o n _ L b l   E l e m e n t T y p e = " C o l u m n "   E l e m e n t I d = " 1 6 3 4 1 8 6 4 0 "   D a t a T y p e = " L a b e l " > P u r c h O r d e r D a t e C a p t i o n _ L b l < / P u r c h O r d e r D a t e C a p t i o n _ L b l > + 
+         < P u r c h O r d e r N u m C a p t i o n _ L b l   E l e m e n t T y p e = " C o l u m n "   E l e m e n t I d = " 4 6 4 1 4 9 4 5 4 "   D a t a T y p e = " L a b e l " > P u r c h O r d e r N u m C a p t i o n _ L b l < / P u r c h O r d e r N u m C a p t i o n _ L b l > + 
+         < R e c e i v e b y _ L b l   E l e m e n t T y p e = " C o l u m n "   E l e m e n t I d = " 9 4 4 0 6 3 6 8 "   D a t a T y p e = " L a b e l " > R e c e i v e b y _ L b l < / R e c e i v e b y _ L b l > + 
+         < R e f e r e n c e T e x t   E l e m e n t T y p e = " C o l u m n "   E l e m e n t I d = " 4 4 5 3 5 3 4 5 1 "   D a t a T y p e = " T e x t " > R e f e r e n c e T e x t < / R e f e r e n c e T e x t > + 
+         < S a l e s P u r c h P e r s o n N a m e   E l e m e n t T y p e = " C o l u m n "   E l e m e n t I d = " 1 3 7 3 7 6 8 5 5 7 "   D a t a T y p e = " T e x t " > S a l e s P u r c h P e r s o n N a m e < / S a l e s P u r c h P e r s o n N a m e > + 
+         < S e l l T o C u s t N o _ P u r c h H e a d e r   E l e m e n t T y p e = " C o l u m n "   E l e m e n t I d = " 9 6 4 8 7 3 2 0 4 "   D a t a T y p e = " C o d e " > S e l l T o C u s t N o _ P u r c h H e a d e r < / S e l l T o C u s t N o _ P u r c h H e a d e r > + 
+         < S e l l T o C u s t N o _ P u r c h H e a d e r _ L b l   E l e m e n t T y p e = " C o l u m n "   E l e m e n t I d = " 1 9 3 1 5 7 0 8 9 7 "   D a t a T y p e = " S t r i n g " > S e l l T o C u s t N o _ P u r c h H e a d e r _ L b l < / S e l l T o C u s t N o _ P u r c h H e a d e r _ L b l > + 
+         < S h i p m e n t M e t h o d D e s c   E l e m e n t T y p e = " C o l u m n "   E l e m e n t I d = " 6 8 6 3 4 3 1 7 9 "   D a t a T y p e = " T e x t " > S h i p m e n t M e t h o d D e s c < / S h i p m e n t M e t h o d D e s c > + 
+         < S h i p m e n t M e t h o d D e s c _ L b l   E l e m e n t T y p e = " C o l u m n "   E l e m e n t I d = " 5 7 9 9 0 1 3 6 6 "   D a t a T y p e = " L a b e l " > S h i p m e n t M e t h o d D e s c _ L b l < / S h i p m e n t M e t h o d D e s c _ L b l > + 
+         < S h i p T o A d d r 1   E l e m e n t T y p e = " C o l u m n "   E l e m e n t I d = " 5 1 2 9 7 9 8 5 0 "   D a t a T y p e = " T e x t " > S h i p T o A d d r 1 < / S h i p T o A d d r 1 > + 
+         < S h i p T o A d d r 2   E l e m e n t T y p e = " C o l u m n "   E l e m e n t I d = " 1 1 5 0 6 7 6 4 6 7 "   D a t a T y p e = " T e x t " > S h i p T o A d d r 2 < / S h i p T o A d d r 2 > + 
+         < S h i p T o A d d r 3   E l e m e n t T y p e = " C o l u m n "   E l e m e n t I d = " 1 7 8 8 3 7 3 0 8 4 "   D a t a T y p e = " T e x t " > S h i p T o A d d r 3 < / S h i p T o A d d r 3 > + 
+         < S h i p T o A d d r 4   E l e m e n t T y p e = " C o l u m n "   E l e m e n t I d = " 1 8 6 8 8 9 7 5 9 5 "   D a t a T y p e = " T e x t " > S h i p T o A d d r 4 < / S h i p T o A d d r 4 > + 
+         < S h i p T o A d d r 5   E l e m e n t T y p e = " C o l u m n "   E l e m e n t I d = " 1 2 3 1 2 0 0 9 7 8 "   D a t a T y p e = " T e x t " > S h i p T o A d d r 5 < / S h i p T o A d d r 5 > + 
+         < S h i p T o A d d r 6   E l e m e n t T y p e = " C o l u m n "   E l e m e n t I d = " 5 9 3 5 0 4 3 6 1 "   D a t a T y p e = " T e x t " > S h i p T o A d d r 6 < / S h i p T o A d d r 6 > + 
+         < S h i p T o A d d r 7   E l e m e n t T y p e = " C o l u m n "   E l e m e n t I d = " 4 4 1 9 2 2 5 6 "   D a t a T y p e = " T e x t " > S h i p T o A d d r 7 < / S h i p T o A d d r 7 > + 
+         < S h i p T o A d d r 8   E l e m e n t T y p e = " C o l u m n "   E l e m e n t I d = " 9 3 1 3 2 2 4 0 7 "   D a t a T y p e = " T e x t " > S h i p T o A d d r 8 < / S h i p T o A d d r 8 > + 
+         < S h i p t o A d d r e s s _ L b l   E l e m e n t T y p e = " C o l u m n "   E l e m e n t I d = " 1 0 4 3 5 1 9 5 7 7 "   D a t a T y p e = " L a b e l " > S h i p t o A d d r e s s _ L b l < / S h i p t o A d d r e s s _ L b l > + 
+         < S h i p T o P h o n e N o   E l e m e n t T y p e = " C o l u m n "   E l e m e n t I d = " 3 6 9 7 0 2 2 5 5 "   D a t a T y p e = " T e x t " > S h i p T o P h o n e N o < / S h i p T o P h o n e N o > + 
+         < S u b t o t a l _ L b l   E l e m e n t T y p e = " C o l u m n "   E l e m e n t I d = " 1 9 6 7 7 9 5 1 4 2 "   D a t a T y p e = " L a b e l " > S u b t o t a l _ L b l < / S u b t o t a l _ L b l > + 
+         < T a x I d e n t T y p e C a p t i o n _ L b l   E l e m e n t T y p e = " C o l u m n "   E l e m e n t I d = " 1 2 3 4 9 8 1 3 2 1 "   D a t a T y p e = " L a b e l " > T a x I d e n t T y p e C a p t i o n _ L b l < / T a x I d e n t T y p e C a p t i o n _ L b l > + 
+         < T o C a p t i o n _ L b l   E l e m e n t T y p e = " C o l u m n "   E l e m e n t I d = " 2 0 3 0 5 3 2 2 2 9 "   D a t a T y p e = " L a b e l " > T o C a p t i o n _ L b l < / T o C a p t i o n _ L b l > + 
+         < T o t a l _ L b l   E l e m e n t T y p e = " C o l u m n "   E l e m e n t I d = " 1 2 1 0 1 0 0 8 7 8 "   D a t a T y p e = " L a b e l " > T o t a l _ L b l < / T o t a l _ L b l > + 
+         < V A L V A T B a s e L C Y _ L b l   E l e m e n t T y p e = " C o l u m n "   E l e m e n t I d = " 1 7 0 5 4 3 5 8 1 1 "   D a t a T y p e = " L a b e l " > V A L V A T B a s e L C Y _ L b l < / V A L V A T B a s e L C Y _ L b l > + 
+         < V A T A m t L i n e I n v D i s c B a s e A m t _ L b l   E l e m e n t T y p e = " C o l u m n "   E l e m e n t I d = " 1 6 4 7 3 8 4 9 1 6 "   D a t a T y p e = " L a b e l " > V A T A m t L i n e I n v D i s c B a s e A m t _ L b l < / V A T A m t L i n e I n v D i s c B a s e A m t _ L b l > + 
+         < V A T A m t L i n e L i n e A m t _ L b l   E l e m e n t T y p e = " C o l u m n "   E l e m e n t I d = " 1 1 3 2 2 4 5 2 5 1 "   D a t a T y p e = " L a b e l " > V A T A m t L i n e L i n e A m t _ L b l < / V A T A m t L i n e L i n e A m t _ L b l > + 
+         < V A T A m t L i n e V A T A m t _ L b l   E l e m e n t T y p e = " C o l u m n "   E l e m e n t I d = " 5 0 9 5 8 8 9 9 8 "   D a t a T y p e = " L a b e l " > V A T A m t L i n e V A T A m t _ L b l < / V A T A m t L i n e V A T A m t _ L b l > + 
+         < V A T A m t L i n e V A T _ L b l   E l e m e n t T y p e = " C o l u m n "   E l e m e n t I d = " 1 1 6 2 6 0 3 1 0 2 "   D a t a T y p e = " L a b e l " > V A T A m t L i n e V A T _ L b l < / V A T A m t L i n e V A T _ L b l > + 
+         < V A T A m t S p e c _ L b l   E l e m e n t T y p e = " C o l u m n "   E l e m e n t I d = " 1 5 0 9 9 9 9 3 4 6 "   D a t a T y p e = " L a b e l " > V A T A m t S p e c _ L b l < / V A T A m t S p e c _ L b l > + 
+         < V A T B a s e D i s c _ P u r c h H e a d e r   E l e m e n t T y p e = " C o l u m n "   E l e m e n t I d = " 1 6 3 9 7 3 7 3 5 8 "   D a t a T y p e = " D e c i m a l " > V A T B a s e D i s c _ P u r c h H e a d e r < / V A T B a s e D i s c _ P u r c h H e a d e r > + 
+         < V A T I d e n t i f i e r _ L b l   E l e m e n t T y p e = " C o l u m n "   E l e m e n t I d = " 1 6 8 6 6 2 3 9 8 4 "   D a t a T y p e = " L a b e l " > V A T I d e n t i f i e r _ L b l < / V A T I d e n t i f i e r _ L b l > + 
+         < V A T N o T e x t   E l e m e n t T y p e = " C o l u m n "   E l e m e n t I d = " 1 9 5 9 6 6 3 4 2 6 "   D a t a T y p e = " T e x t " > V A T N o T e x t < / V A T N o T e x t > + 
+         < V A T R e g N o _ P u r c h H e a d e r   E l e m e n t T y p e = " C o l u m n "   E l e m e n t I d = " 9 8 5 0 3 8 1 8 7 "   D a t a T y p e = " T e x t " > V A T R e g N o _ P u r c h H e a d e r < / V A T R e g N o _ P u r c h H e a d e r > + 
+         < V e n d A d d r 1   E l e m e n t T y p e = " C o l u m n "   E l e m e n t I d = " 2 0 3 8 5 3 5 7 8 "   D a t a T y p e = " T e x t " > V e n d A d d r 1 < / V e n d A d d r 1 > + 
+         < V e n d A d d r 2   E l e m e n t T y p e = " C o l u m n "   E l e m e n t I d = " 8 4 1 5 5 0 1 9 5 "   D a t a T y p e = " T e x t " > V e n d A d d r 2 < / V e n d A d d r 2 > + 
+         < V e n d A d d r 3   E l e m e n t T y p e = " C o l u m n "   E l e m e n t I d = " 1 4 7 9 2 4 6 8 1 2 "   D a t a T y p e = " T e x t " > V e n d A d d r 3 < / V e n d A d d r 3 > + 
+         < V e n d A d d r 4   E l e m e n t T y p e = " C o l u m n "   E l e m e n t I d = " 2 1 1 6 9 4 3 4 2 9 "   D a t a T y p e = " T e x t " > V e n d A d d r 4 < / V e n d A d d r 4 > + 
+         < V e n d A d d r 5   E l e m e n t T y p e = " C o l u m n "   E l e m e n t I d = " 1 5 4 0 3 2 7 2 5 0 "   D a t a T y p e = " T e x t " > V e n d A d d r 5 < / V e n d A d d r 5 > + 
+         < V e n d A d d r 6   E l e m e n t T y p e = " C o l u m n "   E l e m e n t I d = " 9 0 2 6 3 0 6 3 3 "   D a t a T y p e = " T e x t " > V e n d A d d r 6 < / V e n d A d d r 6 > + 
+         < V e n d A d d r 7   E l e m e n t T y p e = " C o l u m n "   E l e m e n t I d = " 2 6 4 9 3 4 0 1 6 "   D a t a T y p e = " T e x t " > V e n d A d d r 7 < / V e n d A d d r 7 > + 
+         < V e n d A d d r 8   E l e m e n t T y p e = " C o l u m n "   E l e m e n t I d = " 1 2 4 0 4 4 8 6 7 9 "   D a t a T y p e = " T e x t " > V e n d A d d r 8 < / V e n d A d d r 8 > + 
+         < V e n d N o _ L b l   E l e m e n t T y p e = " C o l u m n "   E l e m e n t I d = " 1 1 9 1 1 1 2 2 4 0 "   D a t a T y p e = " L a b e l " > V e n d N o _ L b l < / V e n d N o _ L b l > + 
+         < V e n d o r I D C a p t i o n _ L b l   E l e m e n t T y p e = " C o l u m n "   E l e m e n t I d = " 1 1 2 9 2 1 9 5 9 3 "   D a t a T y p e = " L a b e l " > V e n d o r I D C a p t i o n _ L b l < / V e n d o r I D C a p t i o n _ L b l > + 
+         < V e n d o r I n v o i c e N o   E l e m e n t T y p e = " C o l u m n "   E l e m e n t I d = " 8 8 7 3 7 6 2 2 5 "   D a t a T y p e = " C o d e " > V e n d o r I n v o i c e N o < / V e n d o r I n v o i c e N o > + 
+         < V e n d o r I n v o i c e N o _ L b l   E l e m e n t T y p e = " C o l u m n "   E l e m e n t I d = " 1 0 3 4 9 0 0 7 0 0 "   D a t a T y p e = " L a b e l " > V e n d o r I n v o i c e N o _ L b l < / V e n d o r I n v o i c e N o _ L b l > + 
+         < V e n d o r O r d e r N o   E l e m e n t T y p e = " C o l u m n "   E l e m e n t I d = " 1 6 4 1 9 6 8 4 4 6 "   D a t a T y p e = " C o d e " > V e n d o r O r d e r N o < / V e n d o r O r d e r N o > + 
+         < V e n d o r O r d e r N o _ L b l   E l e m e n t T y p e = " C o l u m n "   E l e m e n t I d = " 1 5 7 1 7 5 2 4 7 7 "   D a t a T y p e = " L a b e l " > V e n d o r O r d e r N o _ L b l < / V e n d o r O r d e r N o _ L b l > + 
+         < Y o u r R e f _ P u r c h H e a d e r   E l e m e n t T y p e = " C o l u m n "   E l e m e n t I d = " 1 9 8 5 3 6 8 6 3 1 "   D a t a T y p e = " T e x t " > Y o u r R e f _ P u r c h H e a d e r < / Y o u r R e f _ P u r c h H e a d e r > + 
+         < P u r c h a s e _ L i n e   E l e m e n t T y p e = " D a t a I t e m "   E l e m e n t I d = " 1 2 9 1 3 1 7 9 1 1 " > + 
+             < A l l o w I n v D i s c t x t   E l e m e n t T y p e = " C o l u m n "   E l e m e n t I d = " 2 0 1 2 9 2 1 6 0 8 "   D a t a T y p e = " T e x t " > A l l o w I n v D i s c t x t < / A l l o w I n v D i s c t x t > + 
+             < A l l o w I n v D i s c _ P u r c h L i n e   E l e m e n t T y p e = " C o l u m n "   E l e m e n t I d = " 9 8 2 2 2 1 3 6 3 "   D a t a T y p e = " B o o l e a n " > A l l o w I n v D i s c _ P u r c h L i n e < / A l l o w I n v D i s c _ P u r c h L i n e > + 
+             < A m o u n t I n c l u d i n g V A T   E l e m e n t T y p e = " C o l u m n "   E l e m e n t I d = " 8 9 1 0 4 9 5 7 1 "   D a t a T y p e = " D e c i m a l " > A m o u n t I n c l u d i n g V A T < / A m o u n t I n c l u d i n g V A T > + 
+             < D e s c _ P u r c h L i n e   E l e m e n t T y p e = " C o l u m n "   E l e m e n t I d = " 1 1 6 1 7 0 2 0 8 9 "   D a t a T y p e = " T e x t " > D e s c _ P u r c h L i n e < / D e s c _ P u r c h L i n e > + 
+             < D e s c _ P u r c h L i n e _ L b l   E l e m e n t T y p e = " C o l u m n "   E l e m e n t I d = " 6 6 5 1 1 3 6 5 2 "   D a t a T y p e = " S t r i n g " > D e s c _ P u r c h L i n e _ L b l < / D e s c _ P u r c h L i n e _ L b l > + 
+             < D i r e c t U n i C o s t _ L b l   E l e m e n t T y p e = " C o l u m n "   E l e m e n t I d = " 7 2 1 4 7 6 6 8 4 "   D a t a T y p e = " L a b e l " > D i r e c t U n i C o s t _ L b l < / D i r e c t U n i C o s t _ L b l > + 
+             < D i r U n i t C o s t _ P u r c h L i n e   E l e m e n t T y p e = " C o l u m n "   E l e m e n t I d = " 9 5 0 9 6 2 5 8 6 "   D a t a T y p e = " T e x t " > D i r U n i t C o s t _ P u r c h L i n e < / D i r U n i t C o s t _ P u r c h L i n e > + 
+             < E x p e c t e d R e c e i p t D a t e   E l e m e n t T y p e = " C o l u m n "   E l e m e n t I d = " 1 9 8 8 0 4 6 2 0 5 "   D a t a T y p e = " S t r i n g " > E x p e c t e d R e c e i p t D a t e < / E x p e c t e d R e c e i p t D a t e > + 
+             < E x p e c t e d R e c e i p t D a t e L b l   E l e m e n t T y p e = " C o l u m n "   E l e m e n t I d = " 1 8 0 6 8 4 1 2 7 1 "   D a t a T y p e = " L a b e l " > E x p e c t e d R e c e i p t D a t e L b l < / E x p e c t e d R e c e i p t D a t e L b l > + 
+             < I n v D i s c A m t _ P u r c h L i n e   E l e m e n t T y p e = " C o l u m n "   E l e m e n t I d = " 1 4 5 3 0 9 9 5 8 0 "   D a t a T y p e = " D e c i m a l " > I n v D i s c A m t _ P u r c h L i n e < / I n v D i s c A m t _ P u r c h L i n e > + 
+             < I n v D i s c C a p t i o n _ L b l   E l e m e n t T y p e = " C o l u m n "   E l e m e n t I d = " 1 9 3 9 0 5 8 9 7 4 "   D a t a T y p e = " L a b e l " > I n v D i s c C a p t i o n _ L b l < / I n v D i s c C a p t i o n _ L b l > + 
+             < I t e m N o _ P u r c h L i n e   E l e m e n t T y p e = " C o l u m n "   E l e m e n t I d = " 1 0 5 7 2 2 4 1 4 0 "   D a t a T y p e = " C o d e " > I t e m N o _ P u r c h L i n e < / I t e m N o _ P u r c h L i n e > + 
+             < I t e m R e f e r e n c e N o _ P u r c h L i n e   E l e m e n t T y p e = " C o l u m n "   E l e m e n t I d = " 1 1 5 8 3 9 2 0 3 1 "   D a t a T y p e = " C o d e " > I t e m R e f e r e n c e N o _ P u r c h L i n e < / I t e m R e f e r e n c e N o _ P u r c h L i n e > + 
+             < J o b N o _ P u r c h L i n e   E l e m e n t T y p e = " C o l u m n "   E l e m e n t I d = " 2 7 7 7 0 3 3 2 6 "   D a t a T y p e = " C o d e " > J o b N o _ P u r c h L i n e < / J o b N o _ P u r c h L i n e > + 
+             < J o b N o _ P u r c h L i n e _ L b l   E l e m e n t T y p e = " C o l u m n "   E l e m e n t I d = " 9 6 0 0 7 3 4 1 1 "   D a t a T y p e = " L a b e l " > J o b N o _ P u r c h L i n e _ L b l < / J o b N o _ P u r c h L i n e _ L b l > + 
+             < J o b T a s k N o _ P u r c h L i n e   E l e m e n t T y p e = " C o l u m n "   E l e m e n t I d = " 7 2 6 6 6 9 0 1 1 "   D a t a T y p e = " C o d e " > J o b T a s k N o _ P u r c h L i n e < / J o b T a s k N o _ P u r c h L i n e > + 
+             < J o b T a s k N o _ P u r c h L i n e _ L b l   E l e m e n t T y p e = " C o l u m n "   E l e m e n t I d = " 2 0 4 9 1 3 1 1 8 2 "   D a t a T y p e = " L a b e l " > J o b T a s k N o _ P u r c h L i n e _ L b l < / J o b T a s k N o _ P u r c h L i n e _ L b l > + 
+             < L i n e A m t _ P u r c h L i n e   E l e m e n t T y p e = " C o l u m n "   E l e m e n t I d = " 1 5 9 3 7 5 8 6 7 4 "   D a t a T y p e = " T e x t " > L i n e A m t _ P u r c h L i n e < / L i n e A m t _ P u r c h L i n e > + 
+             < L i n e D i s c _ P u r c h L i n e   E l e m e n t T y p e = " C o l u m n "   E l e m e n t I d = " 2 1 3 3 2 3 3 9 7 3 "   D a t a T y p e = " D e c i m a l " > L i n e D i s c _ P u r c h L i n e < / L i n e D i s c _ P u r c h L i n e > + 
+             < L i n e N o _ P u r c h L i n e   E l e m e n t T y p e = " C o l u m n "   E l e m e n t I d = " 1 7 4 8 8 4 8 6 5 "   D a t a T y p e = " I n t e g e r " > L i n e N o _ P u r c h L i n e < / L i n e N o _ P u r c h L i n e > + 
+             < N o _ P u r c h L i n e   E l e m e n t T y p e = " C o l u m n "   E l e m e n t I d = " 2 8 8 5 5 1 3 4 3 "   D a t a T y p e = " T e x t " > N o _ P u r c h L i n e < / N o _ P u r c h L i n e > + 
+             < N o _ P u r c h L i n e _ L b l   E l e m e n t T y p e = " C o l u m n "   E l e m e n t I d = " 1 8 4 4 9 0 6 5 4 0 "   D a t a T y p e = " S t r i n g " > N o _ P u r c h L i n e _ L b l < / N o _ P u r c h L i n e _ L b l > + 
+             < P l a n n e d R e c e i p t D a t e   E l e m e n t T y p e = " C o l u m n "   E l e m e n t I d = " 1 1 4 0 0 3 3 3 2 1 "   D a t a T y p e = " S t r i n g " > P l a n n e d R e c e i p t D a t e < / P l a n n e d R e c e i p t D a t e > + 
+             < P l a n n e d R e c e i p t D a t e L b l   E l e m e n t T y p e = " C o l u m n "   E l e m e n t I d = " 1 4 7 8 7 6 7 2 9 9 "   D a t a T y p e = " L a b e l " > P l a n n e d R e c e i p t D a t e L b l < / P l a n n e d R e c e i p t D a t e L b l > + 
+             < P r o m i s e d R e c e i p t D a t e   E l e m e n t T y p e = " C o l u m n "   E l e m e n t I d = " 2 9 4 5 3 0 7 8 "   D a t a T y p e = " S t r i n g " > P r o m i s e d R e c e i p t D a t e < / P r o m i s e d R e c e i p t D a t e > + 
+             < P r o m i s e d R e c e i p t D a t e L b l   E l e m e n t T y p e = " C o l u m n "   E l e m e n t I d = " 2 0 2 4 9 3 8 1 7 2 "   D a t a T y p e = " L a b e l " > P r o m i s e d R e c e i p t D a t e L b l < / P r o m i s e d R e c e i p t D a t e L b l > + 
+             < P u r c h L i n e L i n e D i s c _ L b l   E l e m e n t T y p e = " C o l u m n "   E l e m e n t I d = " 5 7 3 7 9 3 8 4 1 "   D a t a T y p e = " L a b e l " > P u r c h L i n e L i n e D i s c _ L b l < / P u r c h L i n e L i n e D i s c _ L b l > + 
+             < P u r c h L i n e _ V A T P c t   E l e m e n t T y p e = " C o l u m n "   E l e m e n t I d = " 1 7 7 5 5 5 6 6 3 6 "   D a t a T y p e = " D e c i m a l " > P u r c h L i n e _ V A T P c t < / P u r c h L i n e _ V A T P c t > + 
+             < Q t y _ P u r c h L i n e   E l e m e n t T y p e = " C o l u m n "   E l e m e n t I d = " 7 8 0 8 5 8 6 7 6 "   D a t a T y p e = " T e x t " > Q t y _ P u r c h L i n e < / Q t y _ P u r c h L i n e > + 
+             < Q t y _ P u r c h L i n e _ L b l   E l e m e n t T y p e = " C o l u m n "   E l e m e n t I d = " 6 6 5 5 0 9 2 9 "   D a t a T y p e = " S t r i n g " > Q t y _ P u r c h L i n e _ L b l < / Q t y _ P u r c h L i n e _ L b l > + 
+             < R e q u e s t e d R e c e i p t D a t e   E l e m e n t T y p e = " C o l u m n "   E l e m e n t I d = " 9 3 3 1 1 2 9 3 1 "   D a t a T y p e = " S t r i n g " > R e q u e s t e d R e c e i p t D a t e < / R e q u e s t e d R e c e i p t D a t e > + 
+             < R e q u e s t e d R e c e i p t D a t e L b l   E l e m e n t T y p e = " C o l u m n "   E l e m e n t I d = " 1 4 4 2 7 6 8 2 3 "   D a t a T y p e = " L a b e l " > R e q u e s t e d R e c e i p t D a t e L b l < / R e q u e s t e d R e c e i p t D a t e L b l > + 
+             < T o t a l I n c l V A T   E l e m e n t T y p e = " C o l u m n "   E l e m e n t I d = " 2 0 6 6 5 7 4 0 8 4 "   D a t a T y p e = " D e c i m a l " > T o t a l I n c l V A T < / T o t a l I n c l V A T > + 
+             < T o t a l P r i c e C a p t i o n _ L b l   E l e m e n t T y p e = " C o l u m n "   E l e m e n t I d = " 1 7 4 8 7 7 2 0 5 5 "   D a t a T y p e = " L a b e l " > T o t a l P r i c e C a p t i o n _ L b l < / T o t a l P r i c e C a p t i o n _ L b l > + 
+             < T y p e _ P u r c h L i n e   E l e m e n t T y p e = " C o l u m n "   E l e m e n t I d = " 8 0 9 4 7 1 0 8 8 "   D a t a T y p e = " S t r i n g " > T y p e _ P u r c h L i n e < / T y p e _ P u r c h L i n e > + 
+             < U n i t P r i c e _ P u r c h L i n e   E l e m e n t T y p e = " C o l u m n "   E l e m e n t I d = " 2 0 6 3 2 5 9 8 1 9 "   D a t a T y p e = " D e c i m a l " > U n i t P r i c e _ P u r c h L i n e < / U n i t P r i c e _ P u r c h L i n e > + 
+             < U n i t P r i c e _ P u r c h L i n e _ L b l   E l e m e n t T y p e = " C o l u m n "   E l e m e n t I d = " 7 0 4 0 2 1 4 6 2 "   D a t a T y p e = " L a b e l " > U n i t P r i c e _ P u r c h L i n e _ L b l < / U n i t P r i c e _ P u r c h L i n e _ L b l > + 
+             < U O M _ P u r c h L i n e   E l e m e n t T y p e = " C o l u m n "   E l e m e n t I d = " 4 4 1 1 3 9 0 4 9 "   D a t a T y p e = " T e x t " > U O M _ P u r c h L i n e < / U O M _ P u r c h L i n e > + 
+             < U O M _ P u r c h L i n e _ L b l   E l e m e n t T y p e = " C o l u m n "   E l e m e n t I d = " 1 8 5 6 1 1 3 1 9 4 "   D a t a T y p e = " L a b e l " > U O M _ P u r c h L i n e _ L b l < / U O M _ P u r c h L i n e _ L b l > + 
+             < V A T D i s c o u n t A m o u n t _ L b l   E l e m e n t T y p e = " C o l u m n "   E l e m e n t I d = " 1 3 5 5 1 2 6 5 3 8 "   D a t a T y p e = " L a b e l " > V A T D i s c o u n t A m o u n t _ L b l < / V A T D i s c o u n t A m o u n t _ L b l > + 
+             < V A T I d e n t i f i e r _ P u r c h L i n e   E l e m e n t T y p e = " C o l u m n "   E l e m e n t I d = " 1 0 5 5 6 1 2 1 2 8 "   D a t a T y p e = " C o d e " > V A T I d e n t i f i e r _ P u r c h L i n e < / V A T I d e n t i f i e r _ P u r c h L i n e > + 
+             < V A T I d e n t i f i e r _ P u r c h L i n e _ L b l   E l e m e n t T y p e = " C o l u m n "   E l e m e n t I d = " 1 4 0 4 1 9 4 8 1 9 "   D a t a T y p e = " S t r i n g " > V A T I d e n t i f i e r _ P u r c h L i n e _ L b l < / V A T I d e n t i f i e r _ P u r c h L i n e _ L b l > + 
+             < V e n d o r I t e m N o _ P u r c h L i n e   E l e m e n t T y p e = " C o l u m n "   E l e m e n t I d = " 1 9 1 8 6 5 6 1 6 0 "   D a t a T y p e = " T e x t " > V e n d o r I t e m N o _ P u r c h L i n e < / V e n d o r I t e m N o _ P u r c h L i n e > + 
+         < / P u r c h a s e _ L i n e > + 
+         < T o t a l s   E l e m e n t T y p e = " D a t a I t e m "   E l e m e n t I d = " 1 8 2 3 9 5 0 0 4 4 " > + 
+             < T o t a l A m o u n t   E l e m e n t T y p e = " C o l u m n "   E l e m e n t I d = " 1 5 5 9 1 6 4 8 7 7 "   D a t a T y p e = " D e c i m a l " > T o t a l A m o u n t < / T o t a l A m o u n t > + 
+             < T o t a l A m o u n t I n c l V A T   E l e m e n t T y p e = " C o l u m n "   E l e m e n t I d = " 1 4 2 2 4 2 7 9 5 2 "   D a t a T y p e = " D e c i m a l " > T o t a l A m o u n t I n c l V A T < / T o t a l A m o u n t I n c l V A T > + 
+             < T o t a l E x c l V A T T e x t   E l e m e n t T y p e = " C o l u m n "   E l e m e n t I d = " 1 3 8 4 8 1 6 4 5 "   D a t a T y p e = " T e x t " > T o t a l E x c l V A T T e x t < / T o t a l E x c l V A T T e x t > + 
+             < T o t a l I n c l V A T T e x t   E l e m e n t T y p e = " C o l u m n "   E l e m e n t I d = " 7 6 1 2 0 3 1 7 7 "   D a t a T y p e = " T e x t " > T o t a l I n c l V A T T e x t < / T o t a l I n c l V A T T e x t > + 
+             < T o t a l I n v o i c e D i s c o u n t A m o u n t   E l e m e n t T y p e = " C o l u m n "   E l e m e n t I d = " 4 0 2 1 7 7 5 1 "   D a t a T y p e = " D e c i m a l " > T o t a l I n v o i c e D i s c o u n t A m o u n t < / T o t a l I n v o i c e D i s c o u n t A m o u n t > + 
+             < T o t a l S u b T o t a l   E l e m e n t T y p e = " C o l u m n "   E l e m e n t I d = " 2 0 9 7 8 7 6 8 0 1 "   D a t a T y p e = " D e c i m a l " > T o t a l S u b T o t a l < / T o t a l S u b T o t a l > + 
+             < T o t a l T e x t   E l e m e n t T y p e = " C o l u m n "   E l e m e n t I d = " 2 3 1 9 1 0 5 1 8 "   D a t a T y p e = " T e x t " > T o t a l T e x t < / T o t a l T e x t > + 
+             < T o t a l V A T A m o u n t   E l e m e n t T y p e = " C o l u m n "   E l e m e n t I d = " 1 6 2 7 1 0 2 3 2 8 "   D a t a T y p e = " D e c i m a l " > T o t a l V A T A m o u n t < / T o t a l V A T A m o u n t > + 
+             < T o t a l V A T B a s e A m o u n t   E l e m e n t T y p e = " C o l u m n "   E l e m e n t I d = " 6 6 3 4 5 3 7 0 9 "   D a t a T y p e = " D e c i m a l " > T o t a l V A T B a s e A m o u n t < / T o t a l V A T B a s e A m o u n t > + 
+             < T o t a l V A T D i s c o u n t A m o u n t   E l e m e n t T y p e = " C o l u m n "   E l e m e n t I d = " 6 8 1 2 9 8 4 1 3 "   D a t a T y p e = " D e c i m a l " > T o t a l V A T D i s c o u n t A m o u n t < / T o t a l V A T D i s c o u n t A m o u n t > + 
+             < V A T A m o u n t T e x t   E l e m e n t T y p e = " C o l u m n "   E l e m e n t I d = " 6 5 0 3 5 8 2 4 7 "   D a t a T y p e = " T e x t " > V A T A m o u n t T e x t < / V A T A m o u n t T e x t > + 
+         < / T o t a l s > + 
+         < V A T C o u n t e r   E l e m e n t T y p e = " D a t a I t e m "   E l e m e n t I d = " 5 5 7 1 2 6 5 0 6 " > + 
+             < V A T A m t L i n e I n v D i s c A m t   E l e m e n t T y p e = " C o l u m n "   E l e m e n t I d = " 1 0 0 7 8 2 8 6 0 "   D a t a T y p e = " D e c i m a l " > V A T A m t L i n e I n v D i s c A m t < / V A T A m t L i n e I n v D i s c A m t > + 
+             < V A T A m t L i n e I n v D i s c B a s e A m t   E l e m e n t T y p e = " C o l u m n "   E l e m e n t I d = " 1 6 9 1 0 0 3 4 1 5 "   D a t a T y p e = " D e c i m a l " > V A T A m t L i n e I n v D i s c B a s e A m t < / V A T A m t L i n e I n v D i s c B a s e A m t > + 
+             < V A T A m t L i n e L i n e A m t   E l e m e n t T y p e = " C o l u m n "   E l e m e n t I d = " 1 8 8 2 1 0 3 2 6 2 "   D a t a T y p e = " D e c i m a l " > V A T A m t L i n e L i n e A m t < / V A T A m t L i n e L i n e A m t > + 
+             < V A T A m t L i n e V A T   E l e m e n t T y p e = " C o l u m n "   E l e m e n t I d = " 2 9 9 0 4 8 9 2 5 "   D a t a T y p e = " D e c i m a l " > V A T A m t L i n e V A T < / V A T A m t L i n e V A T > + 
+             < V A T A m t L i n e V A T A m t   E l e m e n t T y p e = " C o l u m n "   E l e m e n t I d = " 8 4 9 9 7 4 3 4 1 "   D a t a T y p e = " D e c i m a l " > V A T A m t L i n e V A T A m t < / V A T A m t L i n e V A T A m t > + 
+             < V A T A m t L i n e V A T B a s e   E l e m e n t T y p e = " C o l u m n "   E l e m e n t I d = " 1 4 1 9 8 1 6 2 1 8 "   D a t a T y p e = " D e c i m a l " > V A T A m t L i n e V A T B a s e < / V A T A m t L i n e V A T B a s e > + 
+             < V A T A m t L i n e V A T I d e n t i f i e r   E l e m e n t T y p e = " C o l u m n "   E l e m e n t I d = " 4 6 1 3 9 9 7 9 2 "   D a t a T y p e = " C o d e " > V A T A m t L i n e V A T I d e n t i f i e r < / V A T A m t L i n e V A T I d e n t i f i e r > + 
+         < / V A T C o u n t e r > + 
+         < V A T C o u n t e r L C Y   E l e m e n t T y p e = " D a t a I t e m "   E l e m e n t I d = " 9 1 0 2 7 8 4 9 2 " > + 
+             < V A L E x c h R a t e   E l e m e n t T y p e = " C o l u m n "   E l e m e n t I d = " 1 8 3 2 0 7 3 1 5 4 "   D a t a T y p e = " T e x t " > V A L E x c h R a t e < / V A L E x c h R a t e > + 
+             < V A L S p e c L C Y H e a d e r   E l e m e n t T y p e = " C o l u m n "   E l e m e n t I d = " 6 9 9 3 5 8 7 5 8 "   D a t a T y p e = " T e x t " > V A L S p e c L C Y H e a d e r < / V A L S p e c L C Y H e a d e r > + 
+             < V A L V A T A m o u n t L C Y   E l e m e n t T y p e = " C o l u m n "   E l e m e n t I d = " 1 4 4 5 9 7 3 0 8 7 "   D a t a T y p e = " D e c i m a l " > V A L V A T A m o u n t L C Y < / V A L V A T A m o u n t L C Y > + 
+             < V A L V A T B a s e L C Y   E l e m e n t T y p e = " C o l u m n "   E l e m e n t I d = " 1 4 3 9 0 5 7 6 6 6 "   D a t a T y p e = " D e c i m a l " > V A L V A T B a s e L C Y < / V A L V A T B a s e L C Y > + 
+         < / V A T C o u n t e r L C Y > + 
+         < P r e p m t L o o p   E l e m e n t T y p e = " D a t a I t e m "   E l e m e n t I d = " 1 1 5 9 7 3 9 4 0 7 " > + 
+             < P r e p a y m e n t S p e c C a p t i o n   E l e m e n t T y p e = " C o l u m n "   E l e m e n t I d = " 1 6 2 3 2 2 2 3 0 1 "   D a t a T y p e = " L a b e l " > P r e p a y m e n t S p e c C a p t i o n < / P r e p a y m e n t S p e c C a p t i o n > + 
+             < P r e p m t I n v B u D e s c C a p t i o n   E l e m e n t T y p e = " C o l u m n "   E l e m e n t I d = " 1 8 0 7 4 4 6 7 8 "   D a t a T y p e = " L a b e l " > P r e p m t I n v B u D e s c C a p t i o n < / P r e p m t I n v B u D e s c C a p t i o n > + 
+             < P r e p m t I n v B u f A m t   E l e m e n t T y p e = " C o l u m n "   E l e m e n t I d = " 1 0 9 6 9 7 6 1 9 5 "   D a t a T y p e = " D e c i m a l " > P r e p m t I n v B u f A m t < / P r e p m t I n v B u f A m t > + 
+             < P r e p m t I n v B u f D e s c   E l e m e n t T y p e = " C o l u m n "   E l e m e n t I d = " 2 2 5 6 0 3 3 1 8 "   D a t a T y p e = " T e x t " > P r e p m t I n v B u f D e s c < / P r e p m t I n v B u f D e s c > + 
+             < P r e p m t I n v B u f G L A c c N o   E l e m e n t T y p e = " C o l u m n "   E l e m e n t I d = " 8 7 1 9 7 7 4 0 0 "   D a t a T y p e = " C o d e " > P r e p m t I n v B u f G L A c c N o < / P r e p m t I n v B u f G L A c c N o > + 
+             < P r e p m t I n v B u f G L A c c N o C a p t i o n   E l e m e n t T y p e = " C o l u m n "   E l e m e n t I d = " 6 6 7 6 9 7 1 8 "   D a t a T y p e = " L a b e l " > P r e p m t I n v B u f G L A c c N o C a p t i o n < / P r e p m t I n v B u f G L A c c N o C a p t i o n > + 
+             < P r e p m t L i n e A m o u n t   E l e m e n t T y p e = " C o l u m n "   E l e m e n t I d = " 1 3 0 2 3 0 2 1 5 "   D a t a T y p e = " D e c i m a l " > P r e p m t L i n e A m o u n t < / P r e p m t L i n e A m o u n t > + 
+             < P r e p m t T o t a l A m o u n t I n c l V A T   E l e m e n t T y p e = " C o l u m n "   E l e m e n t I d = " 3 2 0 0 3 6 5 9 4 "   D a t a T y p e = " D e c i m a l " > P r e p m t T o t a l A m o u n t I n c l V A T < / P r e p m t T o t a l A m o u n t I n c l V A T > + 
+             < P r e p m t V A T A m o u n t   E l e m e n t T y p e = " C o l u m n "   E l e m e n t I d = " 2 1 0 3 3 9 3 6 6 0 "   D a t a T y p e = " D e c i m a l " > P r e p m t V A T A m o u n t < / P r e p m t V A T A m o u n t > + 
+             < P r e p m t V A T A m o u n t T e x t   E l e m e n t T y p e = " C o l u m n "   E l e m e n t I d = " 1 0 3 1 2 5 7 4 9 5 "   D a t a T y p e = " T e x t " > P r e p m t V A T A m o u n t T e x t < / P r e p m t V A T A m o u n t T e x t > + 
+             < P r e p m t V A T B a s e A m o u n t   E l e m e n t T y p e = " C o l u m n "   E l e m e n t I d = " 1 3 9 2 9 6 6 7 9 "   D a t a T y p e = " D e c i m a l " > P r e p m t V A T B a s e A m o u n t < / P r e p m t V A T B a s e A m o u n t > + 
+             < T o t a l E x c l V A T T e x t 2   E l e m e n t T y p e = " C o l u m n "   E l e m e n t I d = " 1 6 4 4 3 1 2 4 5 7 "   D a t a T y p e = " T e x t " > T o t a l E x c l V A T T e x t 2 < / T o t a l E x c l V A T T e x t 2 > + 
+             < T o t a l I n c l V A T T e x t 2   E l e m e n t T y p e = " C o l u m n "   E l e m e n t I d = " 2 0 8 6 8 8 9 6 8 3 "   D a t a T y p e = " T e x t " > T o t a l I n c l V A T T e x t 2 < / T o t a l I n c l V A T T e x t 2 > + 
+         < / P r e p m t L o o p > + 
+         < P r e p m t V A T C o u n t e r   E l e m e n t T y p e = " D a t a I t e m "   E l e m e n t I d = " 1 6 7 7 6 2 3 1 0 8 " > + 
+             < P r e p m t V A T A m t L i n e L i n e A m t   E l e m e n t T y p e = " C o l u m n "   E l e m e n t I d = " 4 0 2 6 8 5 8 2 4 "   D a t a T y p e = " D e c i m a l " > P r e p m t V A T A m t L i n e L i n e A m t < / P r e p m t V A T A m t L i n e L i n e A m t > + 
+             < P r e p m t V A T A m t L i n e V A T   E l e m e n t T y p e = " C o l u m n "   E l e m e n t I d = " 1 9 1 5 4 9 4 8 5 "   D a t a T y p e = " D e c i m a l " > P r e p m t V A T A m t L i n e V A T < / P r e p m t V A T A m t L i n e V A T > + 
+             < P r e p m t V A T A m t L i n e V A T A m t   E l e m e n t T y p e = " C o l u m n "   E l e m e n t I d = " 1 8 7 1 3 0 1 8 2 9 "   D a t a T y p e = " D e c i m a l " > P r e p m t V A T A m t L i n e V A T A m t < / P r e p m t V A T A m t L i n e V A T A m t > + 
+             < P r e p m t V A T A m t L i n e V A T B a s e   E l e m e n t T y p e = " C o l u m n "   E l e m e n t I d = " 1 2 2 6 9 0 4 6 9 6 "   D a t a T y p e = " D e c i m a l " > P r e p m t V A T A m t L i n e V A T B a s e < / P r e p m t V A T A m t L i n e V A T B a s e > + 
+             < P r e p m t V A T A m t L i n e V A T I d   E l e m e n t T y p e = " C o l u m n "   E l e m e n t I d = " 9 8 2 2 2 4 8 0 0 "   D a t a T y p e = " C o d e " > P r e p m t V A T A m t L i n e V A T I d < / P r e p m t V A T A m t L i n e V A T I d > + 
+             < P r e p y m t V A T A m t S p e c C a p t i o n   E l e m e n t T y p e = " C o l u m n "   E l e m e n t I d = " 2 0 0 9 6 4 9 1 3 8 "   D a t a T y p e = " L a b e l " > P r e p y m t V A T A m t S p e c C a p t i o n < / P r e p y m t V A T A m t S p e c C a p t i o n > + 
+         < / P r e p m t V A T C o u n t e r > + 
+         < L e t t e r T e x t   E l e m e n t T y p e = " D a t a I t e m "   E l e m e n t I d = " 1 5 1 0 3 5 3 8 3 4 " > + 
+             < B o d y T e x t   E l e m e n t T y p e = " C o l u m n "   E l e m e n t I d = " 1 4 9 7 5 9 8 0 8 "   D a t a T y p e = " L a b e l " > B o d y T e x t < / B o d y T e x t > + 
+             < C l o s i n g T e x t   E l e m e n t T y p e = " C o l u m n "   E l e m e n t I d = " 5 1 2 1 3 5 9 0 9 "   D a t a T y p e = " L a b e l " > C l o s i n g T e x t < / C l o s i n g T e x t > + 
+             < G r e e t i n g T e x t   E l e m e n t T y p e = " C o l u m n "   E l e m e n t I d = " 1 1 7 5 2 7 9 2 8 9 "   D a t a T y p e = " L a b e l " > G r e e t i n g T e x t < / G r e e t i n g T e x t > + 
+         < / L e t t e r T e x t > + 
+     < / P u r c h a s e _ H e a d e r > + 
+ < / N a v W o r d R e p o r t X m l P a r t > 
 </file>
 
 <file path=customXml/itemProps1.xml><?xml version="1.0" encoding="utf-8"?>

</xml_diff>